<commit_message>
updated readme, updated documentation
</commit_message>
<xml_diff>
--- a/DOCUMENTATION.docx
+++ b/DOCUMENTATION.docx
@@ -89,21 +89,7 @@
         <w:rPr>
           <w:lang w:val="en-US"/>
         </w:rPr>
-        <w:t xml:space="preserve">I am extremely inexperienced in web design. </w:t>
-      </w:r>
-      <w:proofErr w:type="gramStart"/>
-      <w:r>
-        <w:rPr>
-          <w:lang w:val="en-US"/>
-        </w:rPr>
-        <w:t>However</w:t>
-      </w:r>
-      <w:proofErr w:type="gramEnd"/>
-      <w:r>
-        <w:rPr>
-          <w:lang w:val="en-US"/>
-        </w:rPr>
-        <w:t xml:space="preserve"> there are some animations</w:t>
+        <w:t>I am extremely inexperienced in web design. However there are some animations</w:t>
       </w:r>
       <w:r>
         <w:rPr>
@@ -129,27 +115,33 @@
         <w:rPr>
           <w:lang w:val="en-US"/>
         </w:rPr>
-        <w:t xml:space="preserve"> that I recently learned – such as a typing greeting animation using the </w:t>
-      </w:r>
-      <w:proofErr w:type="gramStart"/>
-      <w:r>
-        <w:rPr>
-          <w:lang w:val="en-US"/>
-        </w:rPr>
-        <w:t>splice(</w:t>
-      </w:r>
-      <w:proofErr w:type="gramEnd"/>
-      <w:r>
-        <w:rPr>
-          <w:lang w:val="en-US"/>
-        </w:rPr>
-        <w:t xml:space="preserve">) function and </w:t>
+        <w:t xml:space="preserve"> that I recently learned – such as a typing greeting animation using the</w:t>
+      </w:r>
+      <w:r>
+        <w:rPr>
+          <w:lang w:val="en-US"/>
+        </w:rPr>
+        <w:t xml:space="preserve"> </w:t>
       </w:r>
       <w:proofErr w:type="spellStart"/>
       <w:r>
         <w:rPr>
           <w:lang w:val="en-US"/>
         </w:rPr>
+        <w:t>js</w:t>
+      </w:r>
+      <w:proofErr w:type="spellEnd"/>
+      <w:r>
+        <w:rPr>
+          <w:lang w:val="en-US"/>
+        </w:rPr>
+        <w:t xml:space="preserve"> splice() function and </w:t>
+      </w:r>
+      <w:proofErr w:type="spellStart"/>
+      <w:r>
+        <w:rPr>
+          <w:lang w:val="en-US"/>
+        </w:rPr>
         <w:t>javascript’s</w:t>
       </w:r>
       <w:proofErr w:type="spellEnd"/>
@@ -157,7 +149,13 @@
         <w:rPr>
           <w:lang w:val="en-US"/>
         </w:rPr>
-        <w:t xml:space="preserve"> timer interval function. I also showcased some basic DOM manipulation with a </w:t>
+        <w:t xml:space="preserve"> timer interval function</w:t>
+      </w:r>
+      <w:r>
+        <w:rPr>
+          <w:lang w:val="en-US"/>
+        </w:rPr>
+        <w:t xml:space="preserve"> There is also a </w:t>
       </w:r>
       <w:proofErr w:type="spellStart"/>
       <w:r>
@@ -172,6 +170,26 @@
           <w:lang w:val="en-US"/>
         </w:rPr>
         <w:t xml:space="preserve"> toggle to switch between different CSS styles.</w:t>
+      </w:r>
+      <w:r>
+        <w:rPr>
+          <w:lang w:val="en-US"/>
+        </w:rPr>
+        <w:t xml:space="preserve"> It uses the browser’s </w:t>
+      </w:r>
+      <w:proofErr w:type="spellStart"/>
+      <w:r>
+        <w:rPr>
+          <w:lang w:val="en-US"/>
+        </w:rPr>
+        <w:t>localstorage</w:t>
+      </w:r>
+      <w:proofErr w:type="spellEnd"/>
+      <w:r>
+        <w:rPr>
+          <w:lang w:val="en-US"/>
+        </w:rPr>
+        <w:t xml:space="preserve"> to store the option that you selected until it is changed.</w:t>
       </w:r>
     </w:p>
     <w:p>
@@ -184,117 +202,140 @@
         <w:rPr>
           <w:lang w:val="en-US"/>
         </w:rPr>
-        <w:t xml:space="preserve">There is also a “return to top” button that using JS to return to the top of the page. </w:t>
+        <w:t>There is also a “return to top” button that us</w:t>
+      </w:r>
+      <w:r>
+        <w:rPr>
+          <w:lang w:val="en-US"/>
+        </w:rPr>
+        <w:t>es a</w:t>
+      </w:r>
+      <w:r>
+        <w:rPr>
+          <w:lang w:val="en-US"/>
+        </w:rPr>
+        <w:t xml:space="preserve"> JS</w:t>
+      </w:r>
+      <w:r>
+        <w:rPr>
+          <w:lang w:val="en-US"/>
+        </w:rPr>
+        <w:t xml:space="preserve"> function</w:t>
+      </w:r>
+      <w:r>
+        <w:rPr>
+          <w:lang w:val="en-US"/>
+        </w:rPr>
+        <w:t xml:space="preserve"> to return to the top of the page. </w:t>
       </w:r>
     </w:p>
     <w:p>
       <w:pPr>
         <w:rPr>
-          <w:b/>
-          <w:bCs/>
           <w:lang w:val="en-US"/>
         </w:rPr>
       </w:pPr>
       <w:r>
         <w:rPr>
-          <w:b/>
-          <w:bCs/>
-          <w:lang w:val="en-US"/>
-        </w:rPr>
-        <w:t>Web Technologies:</w:t>
+          <w:lang w:val="en-US"/>
+        </w:rPr>
+        <w:t>These features showcase basic DOM manipulation proficiency.</w:t>
       </w:r>
     </w:p>
     <w:p>
       <w:pPr>
         <w:rPr>
+          <w:b/>
+          <w:bCs/>
           <w:lang w:val="en-US"/>
         </w:rPr>
       </w:pPr>
       <w:r>
         <w:rPr>
-          <w:lang w:val="en-US"/>
-        </w:rPr>
-        <w:t>Used HTML for the layout and CSS to style it. JavaScript functions are used to detect scrolling and implement the “return to top” button.</w:t>
+          <w:b/>
+          <w:bCs/>
+          <w:lang w:val="en-US"/>
+        </w:rPr>
+        <w:t>Web Technologies:</w:t>
       </w:r>
     </w:p>
     <w:p>
       <w:pPr>
         <w:rPr>
-          <w:b/>
-          <w:bCs/>
           <w:lang w:val="en-US"/>
         </w:rPr>
       </w:pPr>
       <w:r>
         <w:rPr>
-          <w:b/>
-          <w:bCs/>
-          <w:lang w:val="en-US"/>
-        </w:rPr>
-        <w:t>Compatibility:</w:t>
+          <w:lang w:val="en-US"/>
+        </w:rPr>
+        <w:t>Used HTML for the layout and CSS to style it. JavaScript functions are used to detect scrolling and implement the “return to top” button.</w:t>
       </w:r>
     </w:p>
     <w:p>
       <w:pPr>
         <w:rPr>
+          <w:b/>
+          <w:bCs/>
           <w:lang w:val="en-US"/>
         </w:rPr>
       </w:pPr>
       <w:r>
         <w:rPr>
-          <w:lang w:val="en-US"/>
-        </w:rPr>
-        <w:t>Website was created to work on devices of any screen size/width combination. As far as my testing goes this goal was achieved properly and it should display correctly on any device</w:t>
-      </w:r>
-      <w:r>
-        <w:rPr>
-          <w:lang w:val="en-US"/>
-        </w:rPr>
-        <w:t xml:space="preserve"> and be fully responsive.</w:t>
+          <w:b/>
+          <w:bCs/>
+          <w:lang w:val="en-US"/>
+        </w:rPr>
+        <w:t>Compatibility:</w:t>
       </w:r>
     </w:p>
     <w:p>
       <w:pPr>
         <w:rPr>
-          <w:b/>
-          <w:bCs/>
           <w:lang w:val="en-US"/>
         </w:rPr>
       </w:pPr>
       <w:r>
         <w:rPr>
-          <w:b/>
-          <w:bCs/>
-          <w:lang w:val="en-US"/>
-        </w:rPr>
-        <w:t>Navigation:</w:t>
+          <w:lang w:val="en-US"/>
+        </w:rPr>
+        <w:t>Website was created to work on devices of any screen size/width combination. As far as my testing goes this goal was achieved properly and it should display correctly on any device</w:t>
+      </w:r>
+      <w:r>
+        <w:rPr>
+          <w:lang w:val="en-US"/>
+        </w:rPr>
+        <w:t xml:space="preserve"> and be fully responsive.</w:t>
       </w:r>
     </w:p>
     <w:p>
       <w:pPr>
         <w:rPr>
+          <w:b/>
+          <w:bCs/>
           <w:lang w:val="en-US"/>
         </w:rPr>
       </w:pPr>
       <w:r>
         <w:rPr>
-          <w:lang w:val="en-US"/>
-        </w:rPr>
-        <w:t xml:space="preserve">Added a navigation bar to desktop views for extra functionality. </w:t>
-      </w:r>
-      <w:proofErr w:type="gramStart"/>
-      <w:r>
-        <w:rPr>
-          <w:lang w:val="en-US"/>
-        </w:rPr>
-        <w:t>However</w:t>
-      </w:r>
-      <w:proofErr w:type="gramEnd"/>
-      <w:r>
-        <w:rPr>
-          <w:lang w:val="en-US"/>
-        </w:rPr>
-        <w:t xml:space="preserve"> since the website’s layout isn’t very extensive this isn’t really necessary on mobile view and it isn’t visible on smaller screen sizes</w:t>
+          <w:b/>
+          <w:bCs/>
+          <w:lang w:val="en-US"/>
+        </w:rPr>
+        <w:t>Navigation:</w:t>
+      </w:r>
+    </w:p>
+    <w:p>
+      <w:pPr>
+        <w:rPr>
+          <w:lang w:val="en-US"/>
+        </w:rPr>
+      </w:pPr>
+      <w:r>
+        <w:rPr>
+          <w:lang w:val="en-US"/>
+        </w:rPr>
+        <w:t>Added a navigation bar to desktop views for extra functionality. However since the website’s layout isn’t very extensive this isn’t really necessary on mobile view and it isn’t visible on smaller screen sizes</w:t>
       </w:r>
       <w:r>
         <w:rPr>

</xml_diff>